<commit_message>
Edited document with the new title
</commit_message>
<xml_diff>
--- a/Week4_Tutorial4_ICT272-1.docx
+++ b/Week4_Tutorial4_ICT272-1.docx
@@ -2,6 +2,30 @@
 <file path=word/document.xml><?xml version="1.0" encoding="utf-8"?>
 <w:document xmlns:wpc="http://schemas.microsoft.com/office/word/2010/wordprocessingCanvas" xmlns:cx="http://schemas.microsoft.com/office/drawing/2014/chartex" xmlns:cx1="http://schemas.microsoft.com/office/drawing/2015/9/8/chartex" xmlns:cx2="http://schemas.microsoft.com/office/drawing/2015/10/21/chartex" xmlns:cx3="http://schemas.microsoft.com/office/drawing/2016/5/9/chartex" xmlns:cx4="http://schemas.microsoft.com/office/drawing/2016/5/10/chartex" xmlns:cx5="http://schemas.microsoft.com/office/drawing/2016/5/11/chartex" xmlns:cx6="http://schemas.microsoft.com/office/drawing/2016/5/12/chartex" xmlns:cx7="http://schemas.microsoft.com/office/drawing/2016/5/13/chartex" xmlns:cx8="http://schemas.microsoft.com/office/drawing/2016/5/14/chartex" xmlns:mc="http://schemas.openxmlformats.org/markup-compatibility/2006" xmlns:aink="http://schemas.microsoft.com/office/drawing/2016/ink" xmlns:am3d="http://schemas.microsoft.com/office/drawing/2017/model3d" xmlns:o="urn:schemas-microsoft-com:office:office" xmlns:oel="http://schemas.microsoft.com/office/2019/extlst" xmlns:r="http://schemas.openxmlformats.org/officeDocument/2006/relationships" xmlns:m="http://schemas.openxmlformats.org/officeDocument/2006/math" xmlns:v="urn:schemas-microsoft-com:vml" xmlns:wp14="http://schemas.microsoft.com/office/word/2010/wordprocessingDrawing" xmlns:wp="http://schemas.openxmlformats.org/drawingml/2006/wordprocessingDrawing" xmlns:w10="urn:schemas-microsoft-com:office:word" xmlns:w="http://schemas.openxmlformats.org/wordprocessingml/2006/main" xmlns:w14="http://schemas.microsoft.com/office/word/2010/wordml" xmlns:w15="http://schemas.microsoft.com/office/word/2012/wordml" xmlns:w16cex="http://schemas.microsoft.com/office/word/2018/wordml/cex" xmlns:w16cid="http://schemas.microsoft.com/office/word/2016/wordml/cid" xmlns:w16="http://schemas.microsoft.com/office/word/2018/wordml" xmlns:w16du="http://schemas.microsoft.com/office/word/2023/wordml/word16du" xmlns:w16sdtdh="http://schemas.microsoft.com/office/word/2020/wordml/sdtdatahash" xmlns:w16sdtfl="http://schemas.microsoft.com/office/word/2024/wordml/sdtformatlock" xmlns:w16se="http://schemas.microsoft.com/office/word/2015/wordml/symex" xmlns:wpg="http://schemas.microsoft.com/office/word/2010/wordprocessingGroup" xmlns:wpi="http://schemas.microsoft.com/office/word/2010/wordprocessingInk" xmlns:wne="http://schemas.microsoft.com/office/word/2006/wordml" xmlns:wps="http://schemas.microsoft.com/office/word/2010/wordprocessingShape" mc:Ignorable="w14 w15 w16se w16cid w16 w16cex w16sdtdh w16sdtfl w16du wp14">
   <w:body>
+    <w:p>
+      <w:pPr>
+        <w:spacing w:after="230"/>
+        <w:ind w:left="2068"/>
+        <w:rPr>
+          <w:b/>
+          <w:sz w:val="32"/>
+        </w:rPr>
+      </w:pPr>
+      <w:r>
+        <w:rPr>
+          <w:b/>
+          <w:sz w:val="32"/>
+        </w:rPr>
+        <w:t>Edited</w:t>
+      </w:r>
+      <w:r>
+        <w:rPr>
+          <w:b/>
+          <w:sz w:val="32"/>
+        </w:rPr>
+        <w:t xml:space="preserve"> for GitHub version control activity</w:t>
+      </w:r>
+    </w:p>
     <w:p>
       <w:pPr>
         <w:spacing w:after="230"/>
@@ -709,15 +733,7 @@
         <w:ind w:left="35" w:hanging="10"/>
       </w:pPr>
       <w:r>
-        <w:t>Using the same project from exercise 2, go to View-&gt;Home-&gt;</w:t>
-      </w:r>
-      <w:proofErr w:type="spellStart"/>
-      <w:r>
-        <w:t>Index.cshtml</w:t>
-      </w:r>
-      <w:proofErr w:type="spellEnd"/>
-      <w:r>
-        <w:t xml:space="preserve"> </w:t>
+        <w:t xml:space="preserve">Using the same project from exercise 2, go to View-&gt;Home-&gt;Index.cshtml </w:t>
       </w:r>
     </w:p>
     <w:p>
@@ -735,15 +751,7 @@
         <w:ind w:left="35" w:hanging="10"/>
       </w:pPr>
       <w:r>
-        <w:t xml:space="preserve">Add a new HTML code to describe yourself by creating a table and add your name, </w:t>
-      </w:r>
-      <w:proofErr w:type="spellStart"/>
-      <w:r>
-        <w:t>studentid</w:t>
-      </w:r>
-      <w:proofErr w:type="spellEnd"/>
-      <w:r>
-        <w:t xml:space="preserve">, major, and nationality. </w:t>
+        <w:t xml:space="preserve">Add a new HTML code to describe yourself by creating a table and add your name, studentid, major, and nationality. </w:t>
       </w:r>
     </w:p>
     <w:p>
@@ -828,29 +836,7 @@
           <w:szCs w:val="19"/>
           <w:highlight w:val="white"/>
         </w:rPr>
-        <w:t xml:space="preserve">    </w:t>
-      </w:r>
-      <w:proofErr w:type="spellStart"/>
-      <w:r>
-        <w:rPr>
-          <w:rFonts w:ascii="Cascadia Mono" w:eastAsiaTheme="minorEastAsia" w:hAnsi="Cascadia Mono" w:cs="Cascadia Mono"/>
-          <w:kern w:val="0"/>
-          <w:sz w:val="19"/>
-          <w:szCs w:val="19"/>
-          <w:highlight w:val="white"/>
-        </w:rPr>
-        <w:t>ViewData</w:t>
-      </w:r>
-      <w:proofErr w:type="spellEnd"/>
-      <w:r>
-        <w:rPr>
-          <w:rFonts w:ascii="Cascadia Mono" w:eastAsiaTheme="minorEastAsia" w:hAnsi="Cascadia Mono" w:cs="Cascadia Mono"/>
-          <w:kern w:val="0"/>
-          <w:sz w:val="19"/>
-          <w:szCs w:val="19"/>
-          <w:highlight w:val="white"/>
-        </w:rPr>
-        <w:t>[</w:t>
+        <w:t xml:space="preserve">    ViewData[</w:t>
       </w:r>
       <w:r>
         <w:rPr>
@@ -1169,7 +1155,6 @@
         </w:rPr>
         <w:t xml:space="preserve"> </w:t>
       </w:r>
-      <w:proofErr w:type="spellStart"/>
       <w:r>
         <w:rPr>
           <w:rFonts w:ascii="Cascadia Mono" w:eastAsiaTheme="minorEastAsia" w:hAnsi="Cascadia Mono" w:cs="Cascadia Mono"/>
@@ -1181,7 +1166,6 @@
         </w:rPr>
         <w:t>cellspacing</w:t>
       </w:r>
-      <w:proofErr w:type="spellEnd"/>
       <w:r>
         <w:rPr>
           <w:rFonts w:ascii="Cascadia Mono" w:eastAsiaTheme="minorEastAsia" w:hAnsi="Cascadia Mono" w:cs="Cascadia Mono"/>
@@ -1289,7 +1273,6 @@
         </w:rPr>
         <w:t>&lt;</w:t>
       </w:r>
-      <w:proofErr w:type="spellStart"/>
       <w:r>
         <w:rPr>
           <w:rFonts w:ascii="Cascadia Mono" w:eastAsiaTheme="minorEastAsia" w:hAnsi="Cascadia Mono" w:cs="Cascadia Mono"/>
@@ -1301,7 +1284,6 @@
         </w:rPr>
         <w:t>th</w:t>
       </w:r>
-      <w:proofErr w:type="spellEnd"/>
       <w:r>
         <w:rPr>
           <w:rFonts w:ascii="Cascadia Mono" w:eastAsiaTheme="minorEastAsia" w:hAnsi="Cascadia Mono" w:cs="Cascadia Mono"/>
@@ -1334,7 +1316,6 @@
         </w:rPr>
         <w:t>&lt;/</w:t>
       </w:r>
-      <w:proofErr w:type="spellStart"/>
       <w:r>
         <w:rPr>
           <w:rFonts w:ascii="Cascadia Mono" w:eastAsiaTheme="minorEastAsia" w:hAnsi="Cascadia Mono" w:cs="Cascadia Mono"/>
@@ -1346,7 +1327,6 @@
         </w:rPr>
         <w:t>th</w:t>
       </w:r>
-      <w:proofErr w:type="spellEnd"/>
       <w:r>
         <w:rPr>
           <w:rFonts w:ascii="Cascadia Mono" w:eastAsiaTheme="minorEastAsia" w:hAnsi="Cascadia Mono" w:cs="Cascadia Mono"/>
@@ -1615,7 +1595,6 @@
         </w:rPr>
         <w:t>&lt;</w:t>
       </w:r>
-      <w:proofErr w:type="spellStart"/>
       <w:r>
         <w:rPr>
           <w:rFonts w:ascii="Cascadia Mono" w:eastAsiaTheme="minorEastAsia" w:hAnsi="Cascadia Mono" w:cs="Cascadia Mono"/>
@@ -1627,7 +1606,6 @@
         </w:rPr>
         <w:t>th</w:t>
       </w:r>
-      <w:proofErr w:type="spellEnd"/>
       <w:r>
         <w:rPr>
           <w:rFonts w:ascii="Cascadia Mono" w:eastAsiaTheme="minorEastAsia" w:hAnsi="Cascadia Mono" w:cs="Cascadia Mono"/>
@@ -1660,7 +1638,6 @@
         </w:rPr>
         <w:t>&lt;/</w:t>
       </w:r>
-      <w:proofErr w:type="spellStart"/>
       <w:r>
         <w:rPr>
           <w:rFonts w:ascii="Cascadia Mono" w:eastAsiaTheme="minorEastAsia" w:hAnsi="Cascadia Mono" w:cs="Cascadia Mono"/>
@@ -1672,7 +1649,6 @@
         </w:rPr>
         <w:t>th</w:t>
       </w:r>
-      <w:proofErr w:type="spellEnd"/>
       <w:r>
         <w:rPr>
           <w:rFonts w:ascii="Cascadia Mono" w:eastAsiaTheme="minorEastAsia" w:hAnsi="Cascadia Mono" w:cs="Cascadia Mono"/>
@@ -1941,7 +1917,6 @@
         </w:rPr>
         <w:t>&lt;</w:t>
       </w:r>
-      <w:proofErr w:type="spellStart"/>
       <w:r>
         <w:rPr>
           <w:rFonts w:ascii="Cascadia Mono" w:eastAsiaTheme="minorEastAsia" w:hAnsi="Cascadia Mono" w:cs="Cascadia Mono"/>
@@ -1953,7 +1928,6 @@
         </w:rPr>
         <w:t>th</w:t>
       </w:r>
-      <w:proofErr w:type="spellEnd"/>
       <w:r>
         <w:rPr>
           <w:rFonts w:ascii="Cascadia Mono" w:eastAsiaTheme="minorEastAsia" w:hAnsi="Cascadia Mono" w:cs="Cascadia Mono"/>
@@ -1986,7 +1960,6 @@
         </w:rPr>
         <w:t>&lt;/</w:t>
       </w:r>
-      <w:proofErr w:type="spellStart"/>
       <w:r>
         <w:rPr>
           <w:rFonts w:ascii="Cascadia Mono" w:eastAsiaTheme="minorEastAsia" w:hAnsi="Cascadia Mono" w:cs="Cascadia Mono"/>
@@ -1998,7 +1971,6 @@
         </w:rPr>
         <w:t>th</w:t>
       </w:r>
-      <w:proofErr w:type="spellEnd"/>
       <w:r>
         <w:rPr>
           <w:rFonts w:ascii="Cascadia Mono" w:eastAsiaTheme="minorEastAsia" w:hAnsi="Cascadia Mono" w:cs="Cascadia Mono"/>
@@ -2267,7 +2239,6 @@
         </w:rPr>
         <w:t>&lt;</w:t>
       </w:r>
-      <w:proofErr w:type="spellStart"/>
       <w:r>
         <w:rPr>
           <w:rFonts w:ascii="Cascadia Mono" w:eastAsiaTheme="minorEastAsia" w:hAnsi="Cascadia Mono" w:cs="Cascadia Mono"/>
@@ -2279,7 +2250,6 @@
         </w:rPr>
         <w:t>th</w:t>
       </w:r>
-      <w:proofErr w:type="spellEnd"/>
       <w:r>
         <w:rPr>
           <w:rFonts w:ascii="Cascadia Mono" w:eastAsiaTheme="minorEastAsia" w:hAnsi="Cascadia Mono" w:cs="Cascadia Mono"/>
@@ -2312,7 +2282,6 @@
         </w:rPr>
         <w:t>&lt;/</w:t>
       </w:r>
-      <w:proofErr w:type="spellStart"/>
       <w:r>
         <w:rPr>
           <w:rFonts w:ascii="Cascadia Mono" w:eastAsiaTheme="minorEastAsia" w:hAnsi="Cascadia Mono" w:cs="Cascadia Mono"/>
@@ -2324,7 +2293,6 @@
         </w:rPr>
         <w:t>th</w:t>
       </w:r>
-      <w:proofErr w:type="spellEnd"/>
       <w:r>
         <w:rPr>
           <w:rFonts w:ascii="Cascadia Mono" w:eastAsiaTheme="minorEastAsia" w:hAnsi="Cascadia Mono" w:cs="Cascadia Mono"/>
@@ -4908,7 +4876,6 @@
   <w:style w:type="character" w:default="1" w:styleId="DefaultParagraphFont">
     <w:name w:val="Default Paragraph Font"/>
     <w:uiPriority w:val="1"/>
-    <w:semiHidden/>
     <w:unhideWhenUsed/>
   </w:style>
   <w:style w:type="table" w:default="1" w:styleId="TableNormal">

</xml_diff>